<commit_message>
Completed Week 11 Lesson and Lab
</commit_message>
<xml_diff>
--- a/Assignment 2/Assignment 2 Requirements.docx
+++ b/Assignment 2/Assignment 2 Requirements.docx
@@ -1,6 +1,6 @@
 
 <file path=word/document.xml><?xml version="1.0" encoding="utf-8"?>
-<w:document xmlns:wpc="http://schemas.microsoft.com/office/word/2010/wordprocessingCanvas" xmlns:cx="http://schemas.microsoft.com/office/drawing/2014/chartex" xmlns:cx1="http://schemas.microsoft.com/office/drawing/2015/9/8/chartex" xmlns:cx2="http://schemas.microsoft.com/office/drawing/2015/10/21/chartex" xmlns:cx3="http://schemas.microsoft.com/office/drawing/2016/5/9/chartex" xmlns:cx4="http://schemas.microsoft.com/office/drawing/2016/5/10/chartex" xmlns:cx5="http://schemas.microsoft.com/office/drawing/2016/5/11/chartex" xmlns:cx6="http://schemas.microsoft.com/office/drawing/2016/5/12/chartex" xmlns:cx7="http://schemas.microsoft.com/office/drawing/2016/5/13/chartex" xmlns:cx8="http://schemas.microsoft.com/office/drawing/2016/5/14/chartex" xmlns:mc="http://schemas.openxmlformats.org/markup-compatibility/2006" xmlns:aink="http://schemas.microsoft.com/office/drawing/2016/ink" xmlns:am3d="http://schemas.microsoft.com/office/drawing/2017/model3d" xmlns:o="urn:schemas-microsoft-com:office:office" xmlns:r="http://schemas.openxmlformats.org/officeDocument/2006/relationships" xmlns:m="http://schemas.openxmlformats.org/officeDocument/2006/math" xmlns:v="urn:schemas-microsoft-com:vml" xmlns:wp14="http://schemas.microsoft.com/office/word/2010/wordprocessingDrawing" xmlns:wp="http://schemas.openxmlformats.org/drawingml/2006/wordprocessingDrawing" xmlns:w10="urn:schemas-microsoft-com:office:word" xmlns:w="http://schemas.openxmlformats.org/wordprocessingml/2006/main" xmlns:w14="http://schemas.microsoft.com/office/word/2010/wordml" xmlns:w15="http://schemas.microsoft.com/office/word/2012/wordml" xmlns:w16cid="http://schemas.microsoft.com/office/word/2016/wordml/cid" xmlns:w16se="http://schemas.microsoft.com/office/word/2015/wordml/symex" xmlns:wpg="http://schemas.microsoft.com/office/word/2010/wordprocessingGroup" xmlns:wpi="http://schemas.microsoft.com/office/word/2010/wordprocessingInk" xmlns:wne="http://schemas.microsoft.com/office/word/2006/wordml" xmlns:wps="http://schemas.microsoft.com/office/word/2010/wordprocessingShape" mc:Ignorable="w14 w15 w16se w16cid wp14">
+<w:document xmlns:wpc="http://schemas.microsoft.com/office/word/2010/wordprocessingCanvas" xmlns:cx="http://schemas.microsoft.com/office/drawing/2014/chartex" xmlns:cx1="http://schemas.microsoft.com/office/drawing/2015/9/8/chartex" xmlns:cx2="http://schemas.microsoft.com/office/drawing/2015/10/21/chartex" xmlns:cx3="http://schemas.microsoft.com/office/drawing/2016/5/9/chartex" xmlns:cx4="http://schemas.microsoft.com/office/drawing/2016/5/10/chartex" xmlns:cx5="http://schemas.microsoft.com/office/drawing/2016/5/11/chartex" xmlns:cx6="http://schemas.microsoft.com/office/drawing/2016/5/12/chartex" xmlns:cx7="http://schemas.microsoft.com/office/drawing/2016/5/13/chartex" xmlns:cx8="http://schemas.microsoft.com/office/drawing/2016/5/14/chartex" xmlns:mc="http://schemas.openxmlformats.org/markup-compatibility/2006" xmlns:aink="http://schemas.microsoft.com/office/drawing/2016/ink" xmlns:am3d="http://schemas.microsoft.com/office/drawing/2017/model3d" xmlns:o="urn:schemas-microsoft-com:office:office" xmlns:oel="http://schemas.microsoft.com/office/2019/extlst" xmlns:r="http://schemas.openxmlformats.org/officeDocument/2006/relationships" xmlns:m="http://schemas.openxmlformats.org/officeDocument/2006/math" xmlns:v="urn:schemas-microsoft-com:vml" xmlns:wp14="http://schemas.microsoft.com/office/word/2010/wordprocessingDrawing" xmlns:wp="http://schemas.openxmlformats.org/drawingml/2006/wordprocessingDrawing" xmlns:w10="urn:schemas-microsoft-com:office:word" xmlns:w="http://schemas.openxmlformats.org/wordprocessingml/2006/main" xmlns:w14="http://schemas.microsoft.com/office/word/2010/wordml" xmlns:w15="http://schemas.microsoft.com/office/word/2012/wordml" xmlns:w16cex="http://schemas.microsoft.com/office/word/2018/wordml/cex" xmlns:w16cid="http://schemas.microsoft.com/office/word/2016/wordml/cid" xmlns:w16="http://schemas.microsoft.com/office/word/2018/wordml" xmlns:w16du="http://schemas.microsoft.com/office/word/2023/wordml/word16du" xmlns:w16sdtdh="http://schemas.microsoft.com/office/word/2020/wordml/sdtdatahash" xmlns:w16sdtfl="http://schemas.microsoft.com/office/word/2024/wordml/sdtformatlock" xmlns:w16se="http://schemas.microsoft.com/office/word/2015/wordml/symex" xmlns:wpg="http://schemas.microsoft.com/office/word/2010/wordprocessingGroup" xmlns:wpi="http://schemas.microsoft.com/office/word/2010/wordprocessingInk" xmlns:wne="http://schemas.microsoft.com/office/word/2006/wordml" xmlns:wps="http://schemas.microsoft.com/office/word/2010/wordprocessingShape" mc:Ignorable="w14 w15 w16se w16cid w16 w16cex w16sdtdh w16sdtfl w16du wp14">
   <w:body>
     <w:sdt>
       <w:sdtPr>
@@ -1647,16 +1647,16 @@
       <w:pPr>
         <w:pStyle w:val="Heading2"/>
       </w:pPr>
-      <w:bookmarkStart w:id="4" w:name="_Toc53486835"/>
-      <w:bookmarkStart w:id="5" w:name="_Toc192078796"/>
+      <w:bookmarkStart w:id="4" w:name="_Toc192078796"/>
+      <w:bookmarkStart w:id="5" w:name="_Toc53486835"/>
       <w:r>
         <w:t>Report</w:t>
       </w:r>
+      <w:bookmarkEnd w:id="4"/>
+      <w:r>
+        <w:t xml:space="preserve"> </w:t>
+      </w:r>
       <w:bookmarkEnd w:id="5"/>
-      <w:r>
-        <w:t xml:space="preserve"> </w:t>
-      </w:r>
-      <w:bookmarkEnd w:id="4"/>
     </w:p>
     <w:p>
       <w:pPr>
@@ -1971,8 +1971,9 @@
           <w:szCs w:val="22"/>
           <w:lang w:val="en-US"/>
         </w:rPr>
-        <w:t>, model types, feature names, data treatments. Feature names must be in th</w:t>
-      </w:r>
+        <w:t xml:space="preserve">, model types, feature names, data treatments. Feature names must be in this </w:t>
+      </w:r>
+      <w:proofErr w:type="spellStart"/>
       <w:r>
         <w:rPr>
           <w:rFonts w:asciiTheme="minorHAnsi" w:eastAsiaTheme="minorHAnsi" w:hAnsiTheme="minorHAnsi" w:cstheme="minorBidi"/>
@@ -1980,9 +1981,9 @@
           <w:szCs w:val="22"/>
           <w:lang w:val="en-US"/>
         </w:rPr>
-        <w:t xml:space="preserve">is </w:t>
-      </w:r>
-      <w:proofErr w:type="spellStart"/>
+        <w:t>comparision</w:t>
+      </w:r>
+      <w:proofErr w:type="spellEnd"/>
       <w:r>
         <w:rPr>
           <w:rFonts w:asciiTheme="minorHAnsi" w:eastAsiaTheme="minorHAnsi" w:hAnsiTheme="minorHAnsi" w:cstheme="minorBidi"/>
@@ -1990,9 +1991,9 @@
           <w:szCs w:val="22"/>
           <w:lang w:val="en-US"/>
         </w:rPr>
-        <w:t>comparision</w:t>
-      </w:r>
-      <w:proofErr w:type="spellEnd"/>
+        <w:t xml:space="preserve"> table </w:t>
+      </w:r>
+      <w:proofErr w:type="spellStart"/>
       <w:r>
         <w:rPr>
           <w:rFonts w:asciiTheme="minorHAnsi" w:eastAsiaTheme="minorHAnsi" w:hAnsiTheme="minorHAnsi" w:cstheme="minorBidi"/>
@@ -2000,9 +2001,9 @@
           <w:szCs w:val="22"/>
           <w:lang w:val="en-US"/>
         </w:rPr>
-        <w:t xml:space="preserve"> table </w:t>
-      </w:r>
-      <w:proofErr w:type="spellStart"/>
+        <w:t>table</w:t>
+      </w:r>
+      <w:proofErr w:type="spellEnd"/>
       <w:r>
         <w:rPr>
           <w:rFonts w:asciiTheme="minorHAnsi" w:eastAsiaTheme="minorHAnsi" w:hAnsiTheme="minorHAnsi" w:cstheme="minorBidi"/>
@@ -2010,18 +2011,145 @@
           <w:szCs w:val="22"/>
           <w:lang w:val="en-US"/>
         </w:rPr>
-        <w:t>table</w:t>
-      </w:r>
-      <w:proofErr w:type="spellEnd"/>
-      <w:r>
+        <w:t>.</w:t>
+      </w:r>
+    </w:p>
+    <w:p>
+      <w:pPr>
         <w:rPr>
           <w:rFonts w:asciiTheme="minorHAnsi" w:eastAsiaTheme="minorHAnsi" w:hAnsiTheme="minorHAnsi" w:cstheme="minorBidi"/>
           <w:sz w:val="22"/>
           <w:szCs w:val="22"/>
           <w:lang w:val="en-US"/>
         </w:rPr>
-        <w:t>.</w:t>
-      </w:r>
+      </w:pPr>
+    </w:p>
+    <w:p>
+      <w:pPr>
+        <w:rPr>
+          <w:rFonts w:asciiTheme="minorHAnsi" w:eastAsiaTheme="minorHAnsi" w:hAnsiTheme="minorHAnsi" w:cstheme="minorBidi"/>
+          <w:sz w:val="22"/>
+          <w:szCs w:val="22"/>
+          <w:lang w:val="en-US"/>
+        </w:rPr>
+      </w:pPr>
+    </w:p>
+    <w:p>
+      <w:pPr>
+        <w:pStyle w:val="Heading4"/>
+        <w:rPr>
+          <w:rFonts w:eastAsiaTheme="minorHAnsi"/>
+          <w:lang w:val="en-US"/>
+        </w:rPr>
+      </w:pPr>
+      <w:r>
+        <w:rPr>
+          <w:rFonts w:eastAsiaTheme="minorHAnsi"/>
+          <w:lang w:val="en-US"/>
+        </w:rPr>
+        <w:t xml:space="preserve">Must </w:t>
+      </w:r>
+      <w:proofErr w:type="gramStart"/>
+      <w:r>
+        <w:rPr>
+          <w:rFonts w:eastAsiaTheme="minorHAnsi"/>
+          <w:lang w:val="en-US"/>
+        </w:rPr>
+        <w:t>haves</w:t>
+      </w:r>
+      <w:proofErr w:type="gramEnd"/>
+    </w:p>
+    <w:p>
+      <w:pPr>
+        <w:pStyle w:val="ListParagraph"/>
+        <w:numPr>
+          <w:ilvl w:val="0"/>
+          <w:numId w:val="19"/>
+        </w:numPr>
+      </w:pPr>
+      <w:r>
+        <w:t>Use at least 1 stack model</w:t>
+      </w:r>
+    </w:p>
+    <w:p>
+      <w:pPr>
+        <w:pStyle w:val="ListParagraph"/>
+        <w:numPr>
+          <w:ilvl w:val="0"/>
+          <w:numId w:val="19"/>
+        </w:numPr>
+      </w:pPr>
+      <w:r>
+        <w:t xml:space="preserve">Use </w:t>
+      </w:r>
+      <w:proofErr w:type="spellStart"/>
+      <w:r>
+        <w:t>kfold</w:t>
+      </w:r>
+      <w:proofErr w:type="spellEnd"/>
+    </w:p>
+    <w:p>
+      <w:pPr>
+        <w:pStyle w:val="ListParagraph"/>
+        <w:numPr>
+          <w:ilvl w:val="0"/>
+          <w:numId w:val="19"/>
+        </w:numPr>
+      </w:pPr>
+      <w:r>
+        <w:t>Save ALL scalars, and trained models to a binary folder</w:t>
+      </w:r>
+    </w:p>
+    <w:p>
+      <w:pPr>
+        <w:pStyle w:val="ListParagraph"/>
+        <w:numPr>
+          <w:ilvl w:val="0"/>
+          <w:numId w:val="19"/>
+        </w:numPr>
+      </w:pPr>
+      <w:r>
+        <w:t>Imputing missing data</w:t>
+      </w:r>
+    </w:p>
+    <w:p>
+      <w:pPr>
+        <w:pStyle w:val="ListParagraph"/>
+        <w:numPr>
+          <w:ilvl w:val="0"/>
+          <w:numId w:val="19"/>
+        </w:numPr>
+      </w:pPr>
+      <w:proofErr w:type="gramStart"/>
+      <w:r>
+        <w:t>Prevent</w:t>
+      </w:r>
+      <w:proofErr w:type="gramEnd"/>
+      <w:r>
+        <w:t xml:space="preserve"> overfitting</w:t>
+      </w:r>
+    </w:p>
+    <w:p>
+      <w:pPr>
+        <w:pStyle w:val="ListParagraph"/>
+        <w:numPr>
+          <w:ilvl w:val="0"/>
+          <w:numId w:val="19"/>
+        </w:numPr>
+      </w:pPr>
+      <w:r>
+        <w:t>Highest F1 score is 5% free mark</w:t>
+      </w:r>
+    </w:p>
+    <w:p>
+      <w:pPr>
+        <w:rPr>
+          <w:rFonts w:asciiTheme="minorHAnsi" w:eastAsiaTheme="minorHAnsi" w:hAnsiTheme="minorHAnsi" w:cstheme="minorBidi"/>
+          <w:sz w:val="22"/>
+          <w:szCs w:val="22"/>
+          <w:lang w:val="en-US"/>
+        </w:rPr>
+      </w:pPr>
     </w:p>
     <w:p>
       <w:pPr>
@@ -2072,6 +2200,9 @@
       <w:r>
         <w:t>Models are not built and evaluated over multiple runs with random subsets of data.</w:t>
       </w:r>
+      <w:r>
+        <w:t xml:space="preserve"> -&gt; </w:t>
+      </w:r>
     </w:p>
     <w:p>
       <w:pPr>
@@ -2178,6 +2309,7 @@
         </w:numPr>
       </w:pPr>
       <w:r>
+        <w:lastRenderedPageBreak/>
         <w:t>L</w:t>
       </w:r>
       <w:r>
@@ -2255,8 +2387,6 @@
       <w:r>
         <w:t>.</w:t>
       </w:r>
-      <w:bookmarkStart w:id="12" w:name="_GoBack"/>
-      <w:bookmarkEnd w:id="12"/>
     </w:p>
     <w:sectPr>
       <w:pgSz w:w="12240" w:h="15840"/>
@@ -2269,8 +2399,233 @@
 </file>
 
 <file path=word/numbering.xml><?xml version="1.0" encoding="utf-8"?>
-<w:numbering xmlns:wpc="http://schemas.microsoft.com/office/word/2010/wordprocessingCanvas" xmlns:cx="http://schemas.microsoft.com/office/drawing/2014/chartex" xmlns:cx1="http://schemas.microsoft.com/office/drawing/2015/9/8/chartex" xmlns:cx2="http://schemas.microsoft.com/office/drawing/2015/10/21/chartex" xmlns:cx3="http://schemas.microsoft.com/office/drawing/2016/5/9/chartex" xmlns:cx4="http://schemas.microsoft.com/office/drawing/2016/5/10/chartex" xmlns:cx5="http://schemas.microsoft.com/office/drawing/2016/5/11/chartex" xmlns:cx6="http://schemas.microsoft.com/office/drawing/2016/5/12/chartex" xmlns:cx7="http://schemas.microsoft.com/office/drawing/2016/5/13/chartex" xmlns:cx8="http://schemas.microsoft.com/office/drawing/2016/5/14/chartex" xmlns:mc="http://schemas.openxmlformats.org/markup-compatibility/2006" xmlns:aink="http://schemas.microsoft.com/office/drawing/2016/ink" xmlns:am3d="http://schemas.microsoft.com/office/drawing/2017/model3d" xmlns:o="urn:schemas-microsoft-com:office:office" xmlns:r="http://schemas.openxmlformats.org/officeDocument/2006/relationships" xmlns:m="http://schemas.openxmlformats.org/officeDocument/2006/math" xmlns:v="urn:schemas-microsoft-com:vml" xmlns:wp14="http://schemas.microsoft.com/office/word/2010/wordprocessingDrawing" xmlns:wp="http://schemas.openxmlformats.org/drawingml/2006/wordprocessingDrawing" xmlns:w10="urn:schemas-microsoft-com:office:word" xmlns:w="http://schemas.openxmlformats.org/wordprocessingml/2006/main" xmlns:w14="http://schemas.microsoft.com/office/word/2010/wordml" xmlns:w15="http://schemas.microsoft.com/office/word/2012/wordml" xmlns:w16cid="http://schemas.microsoft.com/office/word/2016/wordml/cid" xmlns:w16se="http://schemas.microsoft.com/office/word/2015/wordml/symex" xmlns:wpg="http://schemas.microsoft.com/office/word/2010/wordprocessingGroup" xmlns:wpi="http://schemas.microsoft.com/office/word/2010/wordprocessingInk" xmlns:wne="http://schemas.microsoft.com/office/word/2006/wordml" xmlns:wps="http://schemas.microsoft.com/office/word/2010/wordprocessingShape" mc:Ignorable="w14 w15 w16se w16cid wp14">
+<w:numbering xmlns:wpc="http://schemas.microsoft.com/office/word/2010/wordprocessingCanvas" xmlns:cx="http://schemas.microsoft.com/office/drawing/2014/chartex" xmlns:cx1="http://schemas.microsoft.com/office/drawing/2015/9/8/chartex" xmlns:cx2="http://schemas.microsoft.com/office/drawing/2015/10/21/chartex" xmlns:cx3="http://schemas.microsoft.com/office/drawing/2016/5/9/chartex" xmlns:cx4="http://schemas.microsoft.com/office/drawing/2016/5/10/chartex" xmlns:cx5="http://schemas.microsoft.com/office/drawing/2016/5/11/chartex" xmlns:cx6="http://schemas.microsoft.com/office/drawing/2016/5/12/chartex" xmlns:cx7="http://schemas.microsoft.com/office/drawing/2016/5/13/chartex" xmlns:cx8="http://schemas.microsoft.com/office/drawing/2016/5/14/chartex" xmlns:mc="http://schemas.openxmlformats.org/markup-compatibility/2006" xmlns:aink="http://schemas.microsoft.com/office/drawing/2016/ink" xmlns:am3d="http://schemas.microsoft.com/office/drawing/2017/model3d" xmlns:o="urn:schemas-microsoft-com:office:office" xmlns:oel="http://schemas.microsoft.com/office/2019/extlst" xmlns:r="http://schemas.openxmlformats.org/officeDocument/2006/relationships" xmlns:m="http://schemas.openxmlformats.org/officeDocument/2006/math" xmlns:v="urn:schemas-microsoft-com:vml" xmlns:wp14="http://schemas.microsoft.com/office/word/2010/wordprocessingDrawing" xmlns:wp="http://schemas.openxmlformats.org/drawingml/2006/wordprocessingDrawing" xmlns:w10="urn:schemas-microsoft-com:office:word" xmlns:w="http://schemas.openxmlformats.org/wordprocessingml/2006/main" xmlns:w14="http://schemas.microsoft.com/office/word/2010/wordml" xmlns:w15="http://schemas.microsoft.com/office/word/2012/wordml" xmlns:w16cex="http://schemas.microsoft.com/office/word/2018/wordml/cex" xmlns:w16cid="http://schemas.microsoft.com/office/word/2016/wordml/cid" xmlns:w16="http://schemas.microsoft.com/office/word/2018/wordml" xmlns:w16du="http://schemas.microsoft.com/office/word/2023/wordml/word16du" xmlns:w16sdtdh="http://schemas.microsoft.com/office/word/2020/wordml/sdtdatahash" xmlns:w16sdtfl="http://schemas.microsoft.com/office/word/2024/wordml/sdtformatlock" xmlns:w16se="http://schemas.microsoft.com/office/word/2015/wordml/symex" xmlns:wpg="http://schemas.microsoft.com/office/word/2010/wordprocessingGroup" xmlns:wpi="http://schemas.microsoft.com/office/word/2010/wordprocessingInk" xmlns:wne="http://schemas.microsoft.com/office/word/2006/wordml" xmlns:wps="http://schemas.microsoft.com/office/word/2010/wordprocessingShape" mc:Ignorable="w14 w15 w16se w16cid w16 w16cex w16sdtdh w16sdtfl w16du wp14">
   <w:abstractNum w:abstractNumId="0" w15:restartNumberingAfterBreak="0">
+    <w:nsid w:val="03FD4096"/>
+    <w:multiLevelType w:val="hybridMultilevel"/>
+    <w:tmpl w:val="FC749F02"/>
+    <w:lvl w:ilvl="0" w:tplc="16E6B78E">
+      <w:numFmt w:val="bullet"/>
+      <w:lvlText w:val="-"/>
+      <w:lvlJc w:val="left"/>
+      <w:pPr>
+        <w:ind w:left="720" w:hanging="360"/>
+      </w:pPr>
+      <w:rPr>
+        <w:rFonts w:ascii="Times New Roman" w:eastAsiaTheme="minorHAnsi" w:hAnsi="Times New Roman" w:cs="Times New Roman" w:hint="default"/>
+      </w:rPr>
+    </w:lvl>
+    <w:lvl w:ilvl="1" w:tplc="04090003" w:tentative="1">
+      <w:start w:val="1"/>
+      <w:numFmt w:val="bullet"/>
+      <w:lvlText w:val="o"/>
+      <w:lvlJc w:val="left"/>
+      <w:pPr>
+        <w:ind w:left="1440" w:hanging="360"/>
+      </w:pPr>
+      <w:rPr>
+        <w:rFonts w:ascii="Courier New" w:hAnsi="Courier New" w:cs="Courier New" w:hint="default"/>
+      </w:rPr>
+    </w:lvl>
+    <w:lvl w:ilvl="2" w:tplc="04090005" w:tentative="1">
+      <w:start w:val="1"/>
+      <w:numFmt w:val="bullet"/>
+      <w:lvlText w:val=""/>
+      <w:lvlJc w:val="left"/>
+      <w:pPr>
+        <w:ind w:left="2160" w:hanging="360"/>
+      </w:pPr>
+      <w:rPr>
+        <w:rFonts w:ascii="Wingdings" w:hAnsi="Wingdings" w:hint="default"/>
+      </w:rPr>
+    </w:lvl>
+    <w:lvl w:ilvl="3" w:tplc="04090001" w:tentative="1">
+      <w:start w:val="1"/>
+      <w:numFmt w:val="bullet"/>
+      <w:lvlText w:val=""/>
+      <w:lvlJc w:val="left"/>
+      <w:pPr>
+        <w:ind w:left="2880" w:hanging="360"/>
+      </w:pPr>
+      <w:rPr>
+        <w:rFonts w:ascii="Symbol" w:hAnsi="Symbol" w:hint="default"/>
+      </w:rPr>
+    </w:lvl>
+    <w:lvl w:ilvl="4" w:tplc="04090003" w:tentative="1">
+      <w:start w:val="1"/>
+      <w:numFmt w:val="bullet"/>
+      <w:lvlText w:val="o"/>
+      <w:lvlJc w:val="left"/>
+      <w:pPr>
+        <w:ind w:left="3600" w:hanging="360"/>
+      </w:pPr>
+      <w:rPr>
+        <w:rFonts w:ascii="Courier New" w:hAnsi="Courier New" w:cs="Courier New" w:hint="default"/>
+      </w:rPr>
+    </w:lvl>
+    <w:lvl w:ilvl="5" w:tplc="04090005" w:tentative="1">
+      <w:start w:val="1"/>
+      <w:numFmt w:val="bullet"/>
+      <w:lvlText w:val=""/>
+      <w:lvlJc w:val="left"/>
+      <w:pPr>
+        <w:ind w:left="4320" w:hanging="360"/>
+      </w:pPr>
+      <w:rPr>
+        <w:rFonts w:ascii="Wingdings" w:hAnsi="Wingdings" w:hint="default"/>
+      </w:rPr>
+    </w:lvl>
+    <w:lvl w:ilvl="6" w:tplc="04090001" w:tentative="1">
+      <w:start w:val="1"/>
+      <w:numFmt w:val="bullet"/>
+      <w:lvlText w:val=""/>
+      <w:lvlJc w:val="left"/>
+      <w:pPr>
+        <w:ind w:left="5040" w:hanging="360"/>
+      </w:pPr>
+      <w:rPr>
+        <w:rFonts w:ascii="Symbol" w:hAnsi="Symbol" w:hint="default"/>
+      </w:rPr>
+    </w:lvl>
+    <w:lvl w:ilvl="7" w:tplc="04090003" w:tentative="1">
+      <w:start w:val="1"/>
+      <w:numFmt w:val="bullet"/>
+      <w:lvlText w:val="o"/>
+      <w:lvlJc w:val="left"/>
+      <w:pPr>
+        <w:ind w:left="5760" w:hanging="360"/>
+      </w:pPr>
+      <w:rPr>
+        <w:rFonts w:ascii="Courier New" w:hAnsi="Courier New" w:cs="Courier New" w:hint="default"/>
+      </w:rPr>
+    </w:lvl>
+    <w:lvl w:ilvl="8" w:tplc="04090005" w:tentative="1">
+      <w:start w:val="1"/>
+      <w:numFmt w:val="bullet"/>
+      <w:lvlText w:val=""/>
+      <w:lvlJc w:val="left"/>
+      <w:pPr>
+        <w:ind w:left="6480" w:hanging="360"/>
+      </w:pPr>
+      <w:rPr>
+        <w:rFonts w:ascii="Wingdings" w:hAnsi="Wingdings" w:hint="default"/>
+      </w:rPr>
+    </w:lvl>
+  </w:abstractNum>
+  <w:abstractNum w:abstractNumId="1" w15:restartNumberingAfterBreak="0">
+    <w:nsid w:val="0BFE5358"/>
+    <w:multiLevelType w:val="hybridMultilevel"/>
+    <w:tmpl w:val="95F07B3C"/>
+    <w:lvl w:ilvl="0" w:tplc="04090001">
+      <w:start w:val="1"/>
+      <w:numFmt w:val="bullet"/>
+      <w:lvlText w:val=""/>
+      <w:lvlJc w:val="left"/>
+      <w:pPr>
+        <w:ind w:left="720" w:hanging="360"/>
+      </w:pPr>
+      <w:rPr>
+        <w:rFonts w:ascii="Symbol" w:hAnsi="Symbol" w:hint="default"/>
+      </w:rPr>
+    </w:lvl>
+    <w:lvl w:ilvl="1" w:tplc="FFFFFFFF" w:tentative="1">
+      <w:start w:val="1"/>
+      <w:numFmt w:val="bullet"/>
+      <w:lvlText w:val="o"/>
+      <w:lvlJc w:val="left"/>
+      <w:pPr>
+        <w:ind w:left="1440" w:hanging="360"/>
+      </w:pPr>
+      <w:rPr>
+        <w:rFonts w:ascii="Courier New" w:hAnsi="Courier New" w:cs="Courier New" w:hint="default"/>
+      </w:rPr>
+    </w:lvl>
+    <w:lvl w:ilvl="2" w:tplc="FFFFFFFF" w:tentative="1">
+      <w:start w:val="1"/>
+      <w:numFmt w:val="bullet"/>
+      <w:lvlText w:val=""/>
+      <w:lvlJc w:val="left"/>
+      <w:pPr>
+        <w:ind w:left="2160" w:hanging="360"/>
+      </w:pPr>
+      <w:rPr>
+        <w:rFonts w:ascii="Wingdings" w:hAnsi="Wingdings" w:hint="default"/>
+      </w:rPr>
+    </w:lvl>
+    <w:lvl w:ilvl="3" w:tplc="FFFFFFFF" w:tentative="1">
+      <w:start w:val="1"/>
+      <w:numFmt w:val="bullet"/>
+      <w:lvlText w:val=""/>
+      <w:lvlJc w:val="left"/>
+      <w:pPr>
+        <w:ind w:left="2880" w:hanging="360"/>
+      </w:pPr>
+      <w:rPr>
+        <w:rFonts w:ascii="Symbol" w:hAnsi="Symbol" w:hint="default"/>
+      </w:rPr>
+    </w:lvl>
+    <w:lvl w:ilvl="4" w:tplc="FFFFFFFF" w:tentative="1">
+      <w:start w:val="1"/>
+      <w:numFmt w:val="bullet"/>
+      <w:lvlText w:val="o"/>
+      <w:lvlJc w:val="left"/>
+      <w:pPr>
+        <w:ind w:left="3600" w:hanging="360"/>
+      </w:pPr>
+      <w:rPr>
+        <w:rFonts w:ascii="Courier New" w:hAnsi="Courier New" w:cs="Courier New" w:hint="default"/>
+      </w:rPr>
+    </w:lvl>
+    <w:lvl w:ilvl="5" w:tplc="FFFFFFFF" w:tentative="1">
+      <w:start w:val="1"/>
+      <w:numFmt w:val="bullet"/>
+      <w:lvlText w:val=""/>
+      <w:lvlJc w:val="left"/>
+      <w:pPr>
+        <w:ind w:left="4320" w:hanging="360"/>
+      </w:pPr>
+      <w:rPr>
+        <w:rFonts w:ascii="Wingdings" w:hAnsi="Wingdings" w:hint="default"/>
+      </w:rPr>
+    </w:lvl>
+    <w:lvl w:ilvl="6" w:tplc="FFFFFFFF" w:tentative="1">
+      <w:start w:val="1"/>
+      <w:numFmt w:val="bullet"/>
+      <w:lvlText w:val=""/>
+      <w:lvlJc w:val="left"/>
+      <w:pPr>
+        <w:ind w:left="5040" w:hanging="360"/>
+      </w:pPr>
+      <w:rPr>
+        <w:rFonts w:ascii="Symbol" w:hAnsi="Symbol" w:hint="default"/>
+      </w:rPr>
+    </w:lvl>
+    <w:lvl w:ilvl="7" w:tplc="FFFFFFFF" w:tentative="1">
+      <w:start w:val="1"/>
+      <w:numFmt w:val="bullet"/>
+      <w:lvlText w:val="o"/>
+      <w:lvlJc w:val="left"/>
+      <w:pPr>
+        <w:ind w:left="5760" w:hanging="360"/>
+      </w:pPr>
+      <w:rPr>
+        <w:rFonts w:ascii="Courier New" w:hAnsi="Courier New" w:cs="Courier New" w:hint="default"/>
+      </w:rPr>
+    </w:lvl>
+    <w:lvl w:ilvl="8" w:tplc="FFFFFFFF" w:tentative="1">
+      <w:start w:val="1"/>
+      <w:numFmt w:val="bullet"/>
+      <w:lvlText w:val=""/>
+      <w:lvlJc w:val="left"/>
+      <w:pPr>
+        <w:ind w:left="6480" w:hanging="360"/>
+      </w:pPr>
+      <w:rPr>
+        <w:rFonts w:ascii="Wingdings" w:hAnsi="Wingdings" w:hint="default"/>
+      </w:rPr>
+    </w:lvl>
+  </w:abstractNum>
+  <w:abstractNum w:abstractNumId="2" w15:restartNumberingAfterBreak="0">
     <w:nsid w:val="0C3510CE"/>
     <w:multiLevelType w:val="hybridMultilevel"/>
     <w:tmpl w:val="D1EE34C0"/>
@@ -2383,7 +2738,7 @@
       </w:rPr>
     </w:lvl>
   </w:abstractNum>
-  <w:abstractNum w:abstractNumId="1" w15:restartNumberingAfterBreak="0">
+  <w:abstractNum w:abstractNumId="3" w15:restartNumberingAfterBreak="0">
     <w:nsid w:val="0F101B4C"/>
     <w:multiLevelType w:val="hybridMultilevel"/>
     <w:tmpl w:val="808603AE"/>
@@ -2472,7 +2827,7 @@
       </w:pPr>
     </w:lvl>
   </w:abstractNum>
-  <w:abstractNum w:abstractNumId="2" w15:restartNumberingAfterBreak="0">
+  <w:abstractNum w:abstractNumId="4" w15:restartNumberingAfterBreak="0">
     <w:nsid w:val="0FFE4328"/>
     <w:multiLevelType w:val="hybridMultilevel"/>
     <w:tmpl w:val="30B4BF3A"/>
@@ -2585,7 +2940,7 @@
       </w:rPr>
     </w:lvl>
   </w:abstractNum>
-  <w:abstractNum w:abstractNumId="3" w15:restartNumberingAfterBreak="0">
+  <w:abstractNum w:abstractNumId="5" w15:restartNumberingAfterBreak="0">
     <w:nsid w:val="23DC5C94"/>
     <w:multiLevelType w:val="hybridMultilevel"/>
     <w:tmpl w:val="F23A5F5A"/>
@@ -2674,7 +3029,119 @@
       </w:pPr>
     </w:lvl>
   </w:abstractNum>
-  <w:abstractNum w:abstractNumId="4" w15:restartNumberingAfterBreak="0">
+  <w:abstractNum w:abstractNumId="6" w15:restartNumberingAfterBreak="0">
+    <w:nsid w:val="254172D3"/>
+    <w:multiLevelType w:val="hybridMultilevel"/>
+    <w:tmpl w:val="54A6E572"/>
+    <w:lvl w:ilvl="0" w:tplc="16E6B78E">
+      <w:numFmt w:val="bullet"/>
+      <w:lvlText w:val="-"/>
+      <w:lvlJc w:val="left"/>
+      <w:pPr>
+        <w:ind w:left="720" w:hanging="360"/>
+      </w:pPr>
+      <w:rPr>
+        <w:rFonts w:ascii="Times New Roman" w:eastAsiaTheme="minorHAnsi" w:hAnsi="Times New Roman" w:cs="Times New Roman" w:hint="default"/>
+      </w:rPr>
+    </w:lvl>
+    <w:lvl w:ilvl="1" w:tplc="04090003" w:tentative="1">
+      <w:start w:val="1"/>
+      <w:numFmt w:val="bullet"/>
+      <w:lvlText w:val="o"/>
+      <w:lvlJc w:val="left"/>
+      <w:pPr>
+        <w:ind w:left="1440" w:hanging="360"/>
+      </w:pPr>
+      <w:rPr>
+        <w:rFonts w:ascii="Courier New" w:hAnsi="Courier New" w:cs="Courier New" w:hint="default"/>
+      </w:rPr>
+    </w:lvl>
+    <w:lvl w:ilvl="2" w:tplc="04090005" w:tentative="1">
+      <w:start w:val="1"/>
+      <w:numFmt w:val="bullet"/>
+      <w:lvlText w:val=""/>
+      <w:lvlJc w:val="left"/>
+      <w:pPr>
+        <w:ind w:left="2160" w:hanging="360"/>
+      </w:pPr>
+      <w:rPr>
+        <w:rFonts w:ascii="Wingdings" w:hAnsi="Wingdings" w:hint="default"/>
+      </w:rPr>
+    </w:lvl>
+    <w:lvl w:ilvl="3" w:tplc="04090001" w:tentative="1">
+      <w:start w:val="1"/>
+      <w:numFmt w:val="bullet"/>
+      <w:lvlText w:val=""/>
+      <w:lvlJc w:val="left"/>
+      <w:pPr>
+        <w:ind w:left="2880" w:hanging="360"/>
+      </w:pPr>
+      <w:rPr>
+        <w:rFonts w:ascii="Symbol" w:hAnsi="Symbol" w:hint="default"/>
+      </w:rPr>
+    </w:lvl>
+    <w:lvl w:ilvl="4" w:tplc="04090003" w:tentative="1">
+      <w:start w:val="1"/>
+      <w:numFmt w:val="bullet"/>
+      <w:lvlText w:val="o"/>
+      <w:lvlJc w:val="left"/>
+      <w:pPr>
+        <w:ind w:left="3600" w:hanging="360"/>
+      </w:pPr>
+      <w:rPr>
+        <w:rFonts w:ascii="Courier New" w:hAnsi="Courier New" w:cs="Courier New" w:hint="default"/>
+      </w:rPr>
+    </w:lvl>
+    <w:lvl w:ilvl="5" w:tplc="04090005" w:tentative="1">
+      <w:start w:val="1"/>
+      <w:numFmt w:val="bullet"/>
+      <w:lvlText w:val=""/>
+      <w:lvlJc w:val="left"/>
+      <w:pPr>
+        <w:ind w:left="4320" w:hanging="360"/>
+      </w:pPr>
+      <w:rPr>
+        <w:rFonts w:ascii="Wingdings" w:hAnsi="Wingdings" w:hint="default"/>
+      </w:rPr>
+    </w:lvl>
+    <w:lvl w:ilvl="6" w:tplc="04090001" w:tentative="1">
+      <w:start w:val="1"/>
+      <w:numFmt w:val="bullet"/>
+      <w:lvlText w:val=""/>
+      <w:lvlJc w:val="left"/>
+      <w:pPr>
+        <w:ind w:left="5040" w:hanging="360"/>
+      </w:pPr>
+      <w:rPr>
+        <w:rFonts w:ascii="Symbol" w:hAnsi="Symbol" w:hint="default"/>
+      </w:rPr>
+    </w:lvl>
+    <w:lvl w:ilvl="7" w:tplc="04090003" w:tentative="1">
+      <w:start w:val="1"/>
+      <w:numFmt w:val="bullet"/>
+      <w:lvlText w:val="o"/>
+      <w:lvlJc w:val="left"/>
+      <w:pPr>
+        <w:ind w:left="5760" w:hanging="360"/>
+      </w:pPr>
+      <w:rPr>
+        <w:rFonts w:ascii="Courier New" w:hAnsi="Courier New" w:cs="Courier New" w:hint="default"/>
+      </w:rPr>
+    </w:lvl>
+    <w:lvl w:ilvl="8" w:tplc="04090005" w:tentative="1">
+      <w:start w:val="1"/>
+      <w:numFmt w:val="bullet"/>
+      <w:lvlText w:val=""/>
+      <w:lvlJc w:val="left"/>
+      <w:pPr>
+        <w:ind w:left="6480" w:hanging="360"/>
+      </w:pPr>
+      <w:rPr>
+        <w:rFonts w:ascii="Wingdings" w:hAnsi="Wingdings" w:hint="default"/>
+      </w:rPr>
+    </w:lvl>
+  </w:abstractNum>
+  <w:abstractNum w:abstractNumId="7" w15:restartNumberingAfterBreak="0">
     <w:nsid w:val="26442C96"/>
     <w:multiLevelType w:val="hybridMultilevel"/>
     <w:tmpl w:val="65C469EE"/>
@@ -2787,7 +3254,7 @@
       </w:rPr>
     </w:lvl>
   </w:abstractNum>
-  <w:abstractNum w:abstractNumId="5" w15:restartNumberingAfterBreak="0">
+  <w:abstractNum w:abstractNumId="8" w15:restartNumberingAfterBreak="0">
     <w:nsid w:val="3E0516D6"/>
     <w:multiLevelType w:val="hybridMultilevel"/>
     <w:tmpl w:val="7B00187E"/>
@@ -2900,7 +3367,7 @@
       </w:rPr>
     </w:lvl>
   </w:abstractNum>
-  <w:abstractNum w:abstractNumId="6" w15:restartNumberingAfterBreak="0">
+  <w:abstractNum w:abstractNumId="9" w15:restartNumberingAfterBreak="0">
     <w:nsid w:val="418605E7"/>
     <w:multiLevelType w:val="hybridMultilevel"/>
     <w:tmpl w:val="532C1D34"/>
@@ -3013,7 +3480,7 @@
       </w:rPr>
     </w:lvl>
   </w:abstractNum>
-  <w:abstractNum w:abstractNumId="7" w15:restartNumberingAfterBreak="0">
+  <w:abstractNum w:abstractNumId="10" w15:restartNumberingAfterBreak="0">
     <w:nsid w:val="421F4EF1"/>
     <w:multiLevelType w:val="hybridMultilevel"/>
     <w:tmpl w:val="5E707480"/>
@@ -3126,7 +3593,7 @@
       </w:rPr>
     </w:lvl>
   </w:abstractNum>
-  <w:abstractNum w:abstractNumId="8" w15:restartNumberingAfterBreak="0">
+  <w:abstractNum w:abstractNumId="11" w15:restartNumberingAfterBreak="0">
     <w:nsid w:val="4306095D"/>
     <w:multiLevelType w:val="hybridMultilevel"/>
     <w:tmpl w:val="EA86A1EC"/>
@@ -3239,7 +3706,7 @@
       </w:rPr>
     </w:lvl>
   </w:abstractNum>
-  <w:abstractNum w:abstractNumId="9" w15:restartNumberingAfterBreak="0">
+  <w:abstractNum w:abstractNumId="12" w15:restartNumberingAfterBreak="0">
     <w:nsid w:val="456B663E"/>
     <w:multiLevelType w:val="hybridMultilevel"/>
     <w:tmpl w:val="4DD0759E"/>
@@ -3352,7 +3819,7 @@
       </w:rPr>
     </w:lvl>
   </w:abstractNum>
-  <w:abstractNum w:abstractNumId="10" w15:restartNumberingAfterBreak="0">
+  <w:abstractNum w:abstractNumId="13" w15:restartNumberingAfterBreak="0">
     <w:nsid w:val="56985049"/>
     <w:multiLevelType w:val="hybridMultilevel"/>
     <w:tmpl w:val="8D5A247E"/>
@@ -3465,7 +3932,7 @@
       </w:rPr>
     </w:lvl>
   </w:abstractNum>
-  <w:abstractNum w:abstractNumId="11" w15:restartNumberingAfterBreak="0">
+  <w:abstractNum w:abstractNumId="14" w15:restartNumberingAfterBreak="0">
     <w:nsid w:val="5E2A458E"/>
     <w:multiLevelType w:val="hybridMultilevel"/>
     <w:tmpl w:val="165401B2"/>
@@ -3578,7 +4045,7 @@
       </w:rPr>
     </w:lvl>
   </w:abstractNum>
-  <w:abstractNum w:abstractNumId="12" w15:restartNumberingAfterBreak="0">
+  <w:abstractNum w:abstractNumId="15" w15:restartNumberingAfterBreak="0">
     <w:nsid w:val="6704574E"/>
     <w:multiLevelType w:val="hybridMultilevel"/>
     <w:tmpl w:val="29CE0784"/>
@@ -3691,7 +4158,7 @@
       </w:rPr>
     </w:lvl>
   </w:abstractNum>
-  <w:abstractNum w:abstractNumId="13" w15:restartNumberingAfterBreak="0">
+  <w:abstractNum w:abstractNumId="16" w15:restartNumberingAfterBreak="0">
     <w:nsid w:val="67CD7F46"/>
     <w:multiLevelType w:val="hybridMultilevel"/>
     <w:tmpl w:val="DCB6C63A"/>
@@ -3804,7 +4271,7 @@
       </w:rPr>
     </w:lvl>
   </w:abstractNum>
-  <w:abstractNum w:abstractNumId="14" w15:restartNumberingAfterBreak="0">
+  <w:abstractNum w:abstractNumId="17" w15:restartNumberingAfterBreak="0">
     <w:nsid w:val="73E43F77"/>
     <w:multiLevelType w:val="hybridMultilevel"/>
     <w:tmpl w:val="D29E8C10"/>
@@ -3917,56 +4384,180 @@
       </w:rPr>
     </w:lvl>
   </w:abstractNum>
-  <w:num w:numId="1">
+  <w:abstractNum w:abstractNumId="18" w15:restartNumberingAfterBreak="0">
+    <w:nsid w:val="7CF62BB3"/>
+    <w:multiLevelType w:val="hybridMultilevel"/>
+    <w:tmpl w:val="388CCB5C"/>
+    <w:lvl w:ilvl="0" w:tplc="16E6B78E">
+      <w:numFmt w:val="bullet"/>
+      <w:lvlText w:val="-"/>
+      <w:lvlJc w:val="left"/>
+      <w:pPr>
+        <w:ind w:left="1440" w:hanging="360"/>
+      </w:pPr>
+      <w:rPr>
+        <w:rFonts w:ascii="Times New Roman" w:eastAsiaTheme="minorHAnsi" w:hAnsi="Times New Roman" w:cs="Times New Roman" w:hint="default"/>
+      </w:rPr>
+    </w:lvl>
+    <w:lvl w:ilvl="1" w:tplc="04090003" w:tentative="1">
+      <w:start w:val="1"/>
+      <w:numFmt w:val="bullet"/>
+      <w:lvlText w:val="o"/>
+      <w:lvlJc w:val="left"/>
+      <w:pPr>
+        <w:ind w:left="2160" w:hanging="360"/>
+      </w:pPr>
+      <w:rPr>
+        <w:rFonts w:ascii="Courier New" w:hAnsi="Courier New" w:cs="Courier New" w:hint="default"/>
+      </w:rPr>
+    </w:lvl>
+    <w:lvl w:ilvl="2" w:tplc="04090005" w:tentative="1">
+      <w:start w:val="1"/>
+      <w:numFmt w:val="bullet"/>
+      <w:lvlText w:val=""/>
+      <w:lvlJc w:val="left"/>
+      <w:pPr>
+        <w:ind w:left="2880" w:hanging="360"/>
+      </w:pPr>
+      <w:rPr>
+        <w:rFonts w:ascii="Wingdings" w:hAnsi="Wingdings" w:hint="default"/>
+      </w:rPr>
+    </w:lvl>
+    <w:lvl w:ilvl="3" w:tplc="04090001" w:tentative="1">
+      <w:start w:val="1"/>
+      <w:numFmt w:val="bullet"/>
+      <w:lvlText w:val=""/>
+      <w:lvlJc w:val="left"/>
+      <w:pPr>
+        <w:ind w:left="3600" w:hanging="360"/>
+      </w:pPr>
+      <w:rPr>
+        <w:rFonts w:ascii="Symbol" w:hAnsi="Symbol" w:hint="default"/>
+      </w:rPr>
+    </w:lvl>
+    <w:lvl w:ilvl="4" w:tplc="04090003" w:tentative="1">
+      <w:start w:val="1"/>
+      <w:numFmt w:val="bullet"/>
+      <w:lvlText w:val="o"/>
+      <w:lvlJc w:val="left"/>
+      <w:pPr>
+        <w:ind w:left="4320" w:hanging="360"/>
+      </w:pPr>
+      <w:rPr>
+        <w:rFonts w:ascii="Courier New" w:hAnsi="Courier New" w:cs="Courier New" w:hint="default"/>
+      </w:rPr>
+    </w:lvl>
+    <w:lvl w:ilvl="5" w:tplc="04090005" w:tentative="1">
+      <w:start w:val="1"/>
+      <w:numFmt w:val="bullet"/>
+      <w:lvlText w:val=""/>
+      <w:lvlJc w:val="left"/>
+      <w:pPr>
+        <w:ind w:left="5040" w:hanging="360"/>
+      </w:pPr>
+      <w:rPr>
+        <w:rFonts w:ascii="Wingdings" w:hAnsi="Wingdings" w:hint="default"/>
+      </w:rPr>
+    </w:lvl>
+    <w:lvl w:ilvl="6" w:tplc="04090001" w:tentative="1">
+      <w:start w:val="1"/>
+      <w:numFmt w:val="bullet"/>
+      <w:lvlText w:val=""/>
+      <w:lvlJc w:val="left"/>
+      <w:pPr>
+        <w:ind w:left="5760" w:hanging="360"/>
+      </w:pPr>
+      <w:rPr>
+        <w:rFonts w:ascii="Symbol" w:hAnsi="Symbol" w:hint="default"/>
+      </w:rPr>
+    </w:lvl>
+    <w:lvl w:ilvl="7" w:tplc="04090003" w:tentative="1">
+      <w:start w:val="1"/>
+      <w:numFmt w:val="bullet"/>
+      <w:lvlText w:val="o"/>
+      <w:lvlJc w:val="left"/>
+      <w:pPr>
+        <w:ind w:left="6480" w:hanging="360"/>
+      </w:pPr>
+      <w:rPr>
+        <w:rFonts w:ascii="Courier New" w:hAnsi="Courier New" w:cs="Courier New" w:hint="default"/>
+      </w:rPr>
+    </w:lvl>
+    <w:lvl w:ilvl="8" w:tplc="04090005" w:tentative="1">
+      <w:start w:val="1"/>
+      <w:numFmt w:val="bullet"/>
+      <w:lvlText w:val=""/>
+      <w:lvlJc w:val="left"/>
+      <w:pPr>
+        <w:ind w:left="7200" w:hanging="360"/>
+      </w:pPr>
+      <w:rPr>
+        <w:rFonts w:ascii="Wingdings" w:hAnsi="Wingdings" w:hint="default"/>
+      </w:rPr>
+    </w:lvl>
+  </w:abstractNum>
+  <w:num w:numId="1" w16cid:durableId="1929924466">
+    <w:abstractNumId w:val="17"/>
+  </w:num>
+  <w:num w:numId="2" w16cid:durableId="133986022">
+    <w:abstractNumId w:val="4"/>
+  </w:num>
+  <w:num w:numId="3" w16cid:durableId="233903336">
+    <w:abstractNumId w:val="10"/>
+  </w:num>
+  <w:num w:numId="4" w16cid:durableId="1827358215">
+    <w:abstractNumId w:val="7"/>
+  </w:num>
+  <w:num w:numId="5" w16cid:durableId="1578973179">
+    <w:abstractNumId w:val="13"/>
+  </w:num>
+  <w:num w:numId="6" w16cid:durableId="1175537975">
+    <w:abstractNumId w:val="9"/>
+  </w:num>
+  <w:num w:numId="7" w16cid:durableId="609551482">
+    <w:abstractNumId w:val="3"/>
+  </w:num>
+  <w:num w:numId="8" w16cid:durableId="1099371620">
     <w:abstractNumId w:val="14"/>
   </w:num>
-  <w:num w:numId="2">
+  <w:num w:numId="9" w16cid:durableId="1019085377">
+    <w:abstractNumId w:val="16"/>
+  </w:num>
+  <w:num w:numId="10" w16cid:durableId="1325279965">
+    <w:abstractNumId w:val="15"/>
+  </w:num>
+  <w:num w:numId="11" w16cid:durableId="903837361">
+    <w:abstractNumId w:val="5"/>
+  </w:num>
+  <w:num w:numId="12" w16cid:durableId="1233006328">
+    <w:abstractNumId w:val="8"/>
+  </w:num>
+  <w:num w:numId="13" w16cid:durableId="1533763048">
+    <w:abstractNumId w:val="11"/>
+  </w:num>
+  <w:num w:numId="14" w16cid:durableId="1468739648">
+    <w:abstractNumId w:val="12"/>
+  </w:num>
+  <w:num w:numId="15" w16cid:durableId="1052771686">
     <w:abstractNumId w:val="2"/>
   </w:num>
-  <w:num w:numId="3">
-    <w:abstractNumId w:val="7"/>
-  </w:num>
-  <w:num w:numId="4">
-    <w:abstractNumId w:val="4"/>
-  </w:num>
-  <w:num w:numId="5">
-    <w:abstractNumId w:val="10"/>
-  </w:num>
-  <w:num w:numId="6">
+  <w:num w:numId="16" w16cid:durableId="48697024">
     <w:abstractNumId w:val="6"/>
   </w:num>
-  <w:num w:numId="7">
+  <w:num w:numId="17" w16cid:durableId="828440705">
+    <w:abstractNumId w:val="18"/>
+  </w:num>
+  <w:num w:numId="18" w16cid:durableId="1216427207">
+    <w:abstractNumId w:val="0"/>
+  </w:num>
+  <w:num w:numId="19" w16cid:durableId="758672496">
     <w:abstractNumId w:val="1"/>
-  </w:num>
-  <w:num w:numId="8">
-    <w:abstractNumId w:val="11"/>
-  </w:num>
-  <w:num w:numId="9">
-    <w:abstractNumId w:val="13"/>
-  </w:num>
-  <w:num w:numId="10">
-    <w:abstractNumId w:val="12"/>
-  </w:num>
-  <w:num w:numId="11">
-    <w:abstractNumId w:val="3"/>
-  </w:num>
-  <w:num w:numId="12">
-    <w:abstractNumId w:val="5"/>
-  </w:num>
-  <w:num w:numId="13">
-    <w:abstractNumId w:val="8"/>
-  </w:num>
-  <w:num w:numId="14">
-    <w:abstractNumId w:val="9"/>
-  </w:num>
-  <w:num w:numId="15">
-    <w:abstractNumId w:val="0"/>
   </w:num>
 </w:numbering>
 </file>
 
 <file path=word/styles.xml><?xml version="1.0" encoding="utf-8"?>
-<w:styles xmlns:mc="http://schemas.openxmlformats.org/markup-compatibility/2006" xmlns:r="http://schemas.openxmlformats.org/officeDocument/2006/relationships" xmlns:w="http://schemas.openxmlformats.org/wordprocessingml/2006/main" xmlns:w14="http://schemas.microsoft.com/office/word/2010/wordml" xmlns:w15="http://schemas.microsoft.com/office/word/2012/wordml" xmlns:w16cid="http://schemas.microsoft.com/office/word/2016/wordml/cid" xmlns:w16se="http://schemas.microsoft.com/office/word/2015/wordml/symex" mc:Ignorable="w14 w15 w16se w16cid">
+<w:styles xmlns:mc="http://schemas.openxmlformats.org/markup-compatibility/2006" xmlns:r="http://schemas.openxmlformats.org/officeDocument/2006/relationships" xmlns:w="http://schemas.openxmlformats.org/wordprocessingml/2006/main" xmlns:w14="http://schemas.microsoft.com/office/word/2010/wordml" xmlns:w15="http://schemas.microsoft.com/office/word/2012/wordml" xmlns:w16cex="http://schemas.microsoft.com/office/word/2018/wordml/cex" xmlns:w16cid="http://schemas.microsoft.com/office/word/2016/wordml/cid" xmlns:w16="http://schemas.microsoft.com/office/word/2018/wordml" xmlns:w16du="http://schemas.microsoft.com/office/word/2023/wordml/word16du" xmlns:w16sdtdh="http://schemas.microsoft.com/office/word/2020/wordml/sdtdatahash" xmlns:w16sdtfl="http://schemas.microsoft.com/office/word/2024/wordml/sdtformatlock" xmlns:w16se="http://schemas.microsoft.com/office/word/2015/wordml/symex" mc:Ignorable="w14 w15 w16se w16cid w16 w16cex w16sdtdh w16sdtfl w16du">
   <w:docDefaults>
     <w:rPrDefault>
       <w:rPr>
@@ -3978,7 +4569,7 @@
     </w:rPrDefault>
     <w:pPrDefault/>
   </w:docDefaults>
-  <w:latentStyles w:defLockedState="0" w:defUIPriority="99" w:defSemiHidden="0" w:defUnhideWhenUsed="0" w:defQFormat="0" w:count="375">
+  <w:latentStyles w:defLockedState="0" w:defUIPriority="99" w:defSemiHidden="0" w:defUnhideWhenUsed="0" w:defQFormat="0" w:count="376">
     <w:lsdException w:name="Normal" w:uiPriority="0" w:qFormat="1"/>
     <w:lsdException w:name="heading 1" w:uiPriority="9" w:qFormat="1"/>
     <w:lsdException w:name="heading 2" w:semiHidden="1" w:uiPriority="9" w:unhideWhenUsed="1" w:qFormat="1"/>
@@ -4354,6 +4945,7 @@
     <w:lsdException w:name="Smart Hyperlink" w:semiHidden="1" w:unhideWhenUsed="1"/>
     <w:lsdException w:name="Hashtag" w:semiHidden="1" w:unhideWhenUsed="1"/>
     <w:lsdException w:name="Unresolved Mention" w:semiHidden="1" w:unhideWhenUsed="1"/>
+    <w:lsdException w:name="Smart Link" w:semiHidden="1" w:unhideWhenUsed="1"/>
   </w:latentStyles>
   <w:style w:type="paragraph" w:default="1" w:styleId="Normal">
     <w:name w:val="Normal"/>

</xml_diff>